<commit_message>
Treat EfficientNet-B5 as the final model in the training notebook and docx
Update the training notebook's markdown cells (title, overview, tensor
shapes, model/loss notes, output file names) and the technical
documentation's main text and tables so B5 + aux head is the final
model and B0 appears only as the baseline. Mark the 0.39/0.59/0.33
thresholds, parameter counts, and GPU/batch counts as B0 values, add the
submission notebook to the file list, and drop the outdated
smaller-encoder suggestion.
</commit_message>
<xml_diff>
--- a/docs/UW_Madison_GI_Tract_Segmentation_Technical_Documentation_EN.docx
+++ b/docs/UW_Madison_GI_Tract_Segmentation_Technical_Documentation_EN.docx
@@ -29,7 +29,7 @@
           <w:color w:val="505050"/>
           <w:sz w:val="22"/>
         </w:rPr>
-        <w:t>EfficientNet-B0 U-Net + 2.5D MRI Input + C-order RLE + Class-specific Thresholds</w:t>
+        <w:t xml:space="preserve">EfficientNet-B5 U-Net + Auxiliary Classification Head + 2.5D MRI Input + C-order RLE + Class-specific Thresholds</w:t>
       </w:r>
     </w:p>
     <w:p/>
@@ -231,7 +231,7 @@
                 <w:b w:val="0"/>
                 <w:sz w:val="18"/>
               </w:rPr>
-              <w:t>segmentation_models_pytorch.Unet with EfficientNet-B0 encoder</w:t>
+              <w:t xml:space="preserve">segmentation_models_pytorch.Unet with EfficientNet-B5 encoder and auxiliary organ-presence classification head (baseline: EfficientNet-B0, no auxiliary head)</w:t>
             </w:r>
           </w:p>
         </w:tc>
@@ -278,7 +278,7 @@
                 <w:b w:val="0"/>
                 <w:sz w:val="18"/>
               </w:rPr>
-              <w:t>2.5D input: [slice n-2, slice n, slice n+2], resized to 384 x 384</w:t>
+              <w:t xml:space="preserve">2.5D input: [slice n-2, slice n, slice n+2], resized to 456 x 456 (B0 baseline: 384 x 384)</w:t>
             </w:r>
           </w:p>
         </w:tc>
@@ -325,7 +325,7 @@
                 <w:b w:val="0"/>
                 <w:sz w:val="18"/>
               </w:rPr>
-              <w:t>0.883207 at epoch 16 on fold 0</w:t>
+              <w:t xml:space="preserve">0.9112 at epoch 20 on fold 0 (B0 baseline: 0.8832 at epoch 16)</w:t>
             </w:r>
           </w:p>
         </w:tc>
@@ -372,7 +372,7 @@
                 <w:b w:val="0"/>
                 <w:sz w:val="18"/>
               </w:rPr>
-              <w:t>Public 0.80577 / Private 0.77297</w:t>
+              <w:t xml:space="preserve">Public 0.81244 / Private 0.77691 (B0 baseline: Public 0.80577 / Private 0.77297)</w:t>
             </w:r>
           </w:p>
         </w:tc>
@@ -419,7 +419,7 @@
                 <w:b w:val="0"/>
                 <w:sz w:val="18"/>
               </w:rPr>
-              <w:t>large_bowel=0.39, small_bowel=0.59, stomach=0.33</w:t>
+              <w:t xml:space="preserve">Per-class thresholds re-tuned on the B5 checkpoint, loaded from thresholds_json_path (B0 baseline: large_bowel=0.39, small_bowel=0.59, stomach=0.33)</w:t>
             </w:r>
           </w:p>
         </w:tc>
@@ -435,7 +435,7 @@
           <w:rFonts w:ascii="Liberation Sans" w:hAnsi="Liberation Sans" w:eastAsia="Liberation Sans"/>
           <w:sz w:val="21"/>
         </w:rPr>
-        <w:t>This document summarizes the final model configuration, data pipeline, training setup, threshold tuning procedure, inference design, and final Kaggle submission result. It is based on the provided training notebook, threshold-tuning notebook, and final submission screenshot.</w:t>
+        <w:t>This document summarizes the final model configuration, data pipeline, training setup, threshold tuning procedure, inference design, and final Kaggle submission result. It is based on the training, threshold-tuning, and submission notebooks and the final submission screenshot. The final model is EfficientNet-B5 with an auxiliary classification head; EfficientNet-B0 is the baseline it is compared against.</w:t>
       </w:r>
     </w:p>
     <w:p>
@@ -578,7 +578,20 @@
           <w:rFonts w:ascii="Liberation Sans" w:hAnsi="Liberation Sans" w:eastAsia="Liberation Sans"/>
           <w:sz w:val="20"/>
         </w:rPr>
-        <w:t>Appendix A. Epoch-level Training History</w:t>
+        <w:t xml:space="preserve">Appendix A. Epoch-level Training History (B0 Baseline)</w:t>
+      </w:r>
+    </w:p>
+    <w:p>
+      <w:pPr>
+        <w:pStyle w:val="ListBullet"/>
+        <w:spacing w:after="40"/>
+      </w:pPr>
+      <w:r>
+        <w:rPr>
+          <w:rFonts w:ascii="Liberation Sans" w:hAnsi="Liberation Sans" w:eastAsia="Liberation Sans"/>
+          <w:sz w:val="20"/>
+        </w:rPr>
+        <w:t xml:space="preserve">Appendix B. EfficientNet-B5 Final Model</w:t>
       </w:r>
     </w:p>
     <w:p>
@@ -615,7 +628,7 @@
           <w:rFonts w:ascii="Liberation Sans" w:hAnsi="Liberation Sans" w:eastAsia="Liberation Sans"/>
           <w:sz w:val="21"/>
         </w:rPr>
-        <w:t>The final submission results shown in the competition interface are listed below. Version 5 (EfficientNet-B5 + auxiliary head) is the best submission; Versions 3 and 4 (EfficientNet-B0 baseline) produced the same, lower leaderboard scores.</w:t>
+        <w:t>The final submission results shown in the competition interface are listed below. Version 5 (EfficientNet-B5 + auxiliary head) is the final and best submission; Versions 3 and 4 (EfficientNet-B0 baseline) produced the same, lower leaderboard scores.</w:t>
       </w:r>
     </w:p>
     <w:tbl>
@@ -936,7 +949,7 @@
           <w:rFonts w:ascii="Liberation Sans" w:hAnsi="Liberation Sans" w:eastAsia="Liberation Sans"/>
           <w:sz w:val="21"/>
         </w:rPr>
-        <w:t>The project consists of two main notebooks: one for model training and one for validation-set threshold tuning.</w:t>
+        <w:t xml:space="preserve">The project consists of three notebooks: model training, validation-set threshold tuning, and test-set inference / submission.</w:t>
       </w:r>
     </w:p>
     <w:tbl>
@@ -1022,7 +1035,7 @@
                 <w:b w:val="0"/>
                 <w:sz w:val="17"/>
               </w:rPr>
-              <w:t>uw-madison-gi-tract-image-segmentation-version4.ipynb</w:t>
+              <w:t xml:space="preserve">uw-madison-gi-tract-image-segmentation.ipynb</w:t>
             </w:r>
           </w:p>
         </w:tc>
@@ -1043,7 +1056,7 @@
                 <w:b w:val="0"/>
                 <w:sz w:val="17"/>
               </w:rPr>
-              <w:t>Main training notebook. It reads the dataset, applies C-order RLE decoding, builds 2.5D inputs, creates GroupKFold splits, trains an EfficientNet-B0 U-Net model, validates the model, and saves the best checkpoint.</w:t>
+              <w:t>Main training notebook. It reads the dataset, applies C-order RLE decoding, builds 2.5D inputs, creates GroupKFold splits, trains an EfficientNet-B5 U-Net with an auxiliary classification head (EfficientNet-B0 for the baseline), validates the model, and saves the best checkpoint.</w:t>
             </w:r>
           </w:p>
         </w:tc>
@@ -1091,6 +1104,53 @@
                 <w:sz w:val="17"/>
               </w:rPr>
               <w:t>Threshold-tuning notebook. It loads the best checkpoint, evaluates the fold 0 validation set, searches class-specific probability thresholds, and compares tuned thresholds against the default threshold of 0.5.</w:t>
+            </w:r>
+          </w:p>
+        </w:tc>
+      </w:tr>
+      <w:tr>
+        <w:trPr>
+          <w:cantSplit/>
+        </w:trPr>
+        <w:tc>
+          <w:tcPr>
+            <w:tcW w:type="dxa" w:w="4032"/>
+            <w:vAlign w:val="center"/>
+          </w:tcPr>
+          <w:p>
+            <w:pPr>
+              <w:spacing w:after="0"/>
+              <w:jc w:val="left"/>
+            </w:pPr>
+            <w:r/>
+            <w:r>
+              <w:rPr>
+                <w:rFonts w:ascii="Liberation Sans" w:hAnsi="Liberation Sans" w:eastAsia="Liberation Sans"/>
+                <w:b w:val="0"/>
+                <w:sz w:val="17"/>
+              </w:rPr>
+              <w:t xml:space="preserve">gi-tract-image-segmentation-submission-notebook.ipynb</w:t>
+            </w:r>
+          </w:p>
+        </w:tc>
+        <w:tc>
+          <w:tcPr>
+            <w:tcW w:type="dxa" w:w="6192"/>
+            <w:vAlign w:val="center"/>
+          </w:tcPr>
+          <w:p>
+            <w:pPr>
+              <w:spacing w:after="0"/>
+              <w:jc w:val="left"/>
+            </w:pPr>
+            <w:r/>
+            <w:r>
+              <w:rPr>
+                <w:rFonts w:ascii="Liberation Sans" w:hAnsi="Liberation Sans" w:eastAsia="Liberation Sans"/>
+                <w:b w:val="0"/>
+                <w:sz w:val="17"/>
+              </w:rPr>
+              <w:t xml:space="preserve">Inference notebook. It installs segmentation-models-pytorch and timm offline from wheel files, loads the B5 checkpoint and the tuned thresholds, runs test inference, encodes C-order RLE, and writes submission.csv.</w:t>
             </w:r>
           </w:p>
         </w:tc>
@@ -1239,7 +1299,7 @@
                 <w:b w:val="0"/>
                 <w:sz w:val="17"/>
               </w:rPr>
-              <w:t>best_effnetb0_unet_c_order_fold0.pth</w:t>
+              <w:t xml:space="preserve">best_effnetb5_unet_c_order_fold0.pth</w:t>
             </w:r>
           </w:p>
         </w:tc>
@@ -1260,7 +1320,7 @@
                 <w:b w:val="0"/>
                 <w:sz w:val="17"/>
               </w:rPr>
-              <w:t>Best fold 0 model checkpoint. The best epoch is 16.</w:t>
+              <w:t xml:space="preserve">Best fold 0 model checkpoint. The best epoch is 20 (B0 baseline: best_effnetb0_unet_c_order_fold0.pth, best epoch 16).</w:t>
             </w:r>
           </w:p>
         </w:tc>
@@ -1276,7 +1336,7 @@
           </w:tcPr>
           <w:p>
             <w:r>
-              <w:t>last_effnetb0_unet_c_order_fold0.pth</w:t>
+              <w:t xml:space="preserve">last_effnetb5_unet_c_order_fold0.pth</w:t>
             </w:r>
           </w:p>
         </w:tc>
@@ -1313,7 +1373,7 @@
                 <w:b w:val="0"/>
                 <w:sz w:val="17"/>
               </w:rPr>
-              <w:t>training_history_c_order_fold0.csv</w:t>
+              <w:t xml:space="preserve">training_history_effnetb5_c_order_fold0.csv</w:t>
             </w:r>
           </w:p>
         </w:tc>
@@ -1334,7 +1394,7 @@
                 <w:b w:val="0"/>
                 <w:sz w:val="17"/>
               </w:rPr>
-              <w:t>Epoch-level training history including loss, Dice score, and per-class validation Dice.</w:t>
+              <w:t xml:space="preserve">Epoch-level training history including loss, Dice score, and per-class validation Dice (B0 baseline: training_history_effnetb0_c_order_fold0.csv).</w:t>
             </w:r>
           </w:p>
         </w:tc>
@@ -2157,7 +2217,7 @@
           <w:rFonts w:ascii="Liberation Sans" w:hAnsi="Liberation Sans" w:eastAsia="Liberation Sans"/>
           <w:sz w:val="21"/>
         </w:rPr>
-        <w:t>For each sample, the target mask has three channels: large_bowel, small_bowel, and stomach. During training, images are resized to 384 x 384 with bilinear interpolation, while masks are resized with nearest-neighbor interpolation to preserve binary labels.</w:t>
+        <w:t>For each sample, the target mask has three channels: large_bowel, small_bowel, and stomach. During training, images are resized to 456 x 456 (384 x 384 for the B0 baseline) with bilinear interpolation, while masks are resized with nearest-neighbor interpolation to preserve binary labels.</w:t>
       </w:r>
     </w:p>
     <w:tbl>
@@ -2308,7 +2368,7 @@
                 <w:b w:val="0"/>
                 <w:sz w:val="18"/>
               </w:rPr>
-              <w:t>3 x 384 x 384</w:t>
+              <w:t xml:space="preserve">3 x 456 x 456</w:t>
             </w:r>
           </w:p>
         </w:tc>
@@ -2376,7 +2436,7 @@
                 <w:b w:val="0"/>
                 <w:sz w:val="18"/>
               </w:rPr>
-              <w:t>3 x 384 x 384</w:t>
+              <w:t xml:space="preserve">3 x 456 x 456</w:t>
             </w:r>
           </w:p>
         </w:tc>
@@ -2731,7 +2791,7 @@
           <w:rFonts w:ascii="Liberation Sans" w:hAnsi="Liberation Sans" w:eastAsia="Liberation Sans"/>
           <w:sz w:val="21"/>
         </w:rPr>
-        <w:t>The final model is a U-Net implemented through segmentation_models_pytorch. The encoder is EfficientNet-B0 with ImageNet-pretrained weights during training. The model uses three input channels and outputs three segmentation logits. The activation inside the model head is set to None, so probabilities are obtained later by applying sigmoid to the logits.</w:t>
+        <w:t xml:space="preserve">The final model is a U-Net implemented through segmentation_models_pytorch. The encoder is EfficientNet-B5 with ImageNet-pretrained weights during training, and an auxiliary classification head, added through aux_params, shares the encoder and predicts one presence logit per organ. The model uses three input channels and returns a tuple (seg_logits, cls_logits): three segmentation logits and three presence logits. The activation inside both heads is set to None, so probabilities are obtained later by applying sigmoid to the logits. The B0 baseline used the same U-Net with an EfficientNet-B0 encoder and no auxiliary head.</w:t>
       </w:r>
     </w:p>
     <w:tbl>
@@ -2932,7 +2992,7 @@
                 <w:b w:val="0"/>
                 <w:sz w:val="18"/>
               </w:rPr>
-              <w:t>EfficientNet-B0</w:t>
+              <w:t xml:space="preserve">EfficientNet-B5 (B0 baseline: EfficientNet-B0)</w:t>
             </w:r>
           </w:p>
         </w:tc>
@@ -3120,7 +3180,7 @@
                 <w:b w:val="0"/>
                 <w:sz w:val="18"/>
               </w:rPr>
-              <w:t>None; raw logits are returned</w:t>
+              <w:t xml:space="preserve">None; raw logits are returned by both heads</w:t>
             </w:r>
           </w:p>
         </w:tc>
@@ -3146,7 +3206,7 @@
                 <w:b w:val="0"/>
                 <w:sz w:val="18"/>
               </w:rPr>
-              <w:t>Total parameters</w:t>
+              <w:t xml:space="preserve">Auxiliary classification head</w:t>
             </w:r>
           </w:p>
         </w:tc>
@@ -3167,7 +3227,7 @@
                 <w:b w:val="0"/>
                 <w:sz w:val="18"/>
               </w:rPr>
-              <w:t>6,251,759</w:t>
+              <w:t xml:space="preserve">aux_params: avg pooling, dropout 0.2, 3 presence logits (none in the B0 baseline)</w:t>
             </w:r>
           </w:p>
         </w:tc>
@@ -3193,7 +3253,54 @@
                 <w:b w:val="0"/>
                 <w:sz w:val="18"/>
               </w:rPr>
-              <w:t>Trainable parameters</w:t>
+              <w:t xml:space="preserve">Total parameters (B0 baseline)</w:t>
+            </w:r>
+          </w:p>
+        </w:tc>
+        <w:tc>
+          <w:tcPr>
+            <w:tcW w:type="dxa" w:w="5112"/>
+            <w:vAlign w:val="center"/>
+          </w:tcPr>
+          <w:p>
+            <w:pPr>
+              <w:spacing w:after="0"/>
+              <w:jc w:val="left"/>
+            </w:pPr>
+            <w:r/>
+            <w:r>
+              <w:rPr>
+                <w:rFonts w:ascii="Liberation Sans" w:hAnsi="Liberation Sans" w:eastAsia="Liberation Sans"/>
+                <w:b w:val="0"/>
+                <w:sz w:val="18"/>
+              </w:rPr>
+              <w:t>6,251,759</w:t>
+            </w:r>
+          </w:p>
+        </w:tc>
+      </w:tr>
+      <w:tr>
+        <w:trPr>
+          <w:cantSplit/>
+        </w:trPr>
+        <w:tc>
+          <w:tcPr>
+            <w:tcW w:type="dxa" w:w="5112"/>
+            <w:vAlign w:val="center"/>
+          </w:tcPr>
+          <w:p>
+            <w:pPr>
+              <w:spacing w:after="0"/>
+              <w:jc w:val="left"/>
+            </w:pPr>
+            <w:r/>
+            <w:r>
+              <w:rPr>
+                <w:rFonts w:ascii="Liberation Sans" w:hAnsi="Liberation Sans" w:eastAsia="Liberation Sans"/>
+                <w:b w:val="0"/>
+                <w:sz w:val="18"/>
+              </w:rPr>
+              <w:t xml:space="preserve">Trainable parameters (B0 baseline)</w:t>
             </w:r>
           </w:p>
         </w:tc>
@@ -3242,11 +3349,11 @@
           <w:rFonts w:ascii="Liberation Mono" w:hAnsi="Liberation Mono" w:eastAsia="Liberation Mono"/>
           <w:sz w:val="16"/>
         </w:rPr>
-        <w:t>2.5D input [3 x 384 x 384]</w:t>
+        <w:t xml:space="preserve">2.5D input [3 x 456 x 456]</w:t>
         <w:br/>
         <w:t xml:space="preserve">        ↓</w:t>
         <w:br/>
-        <w:t>EfficientNet-B0 encoder</w:t>
+        <w:t xml:space="preserve">EfficientNet-B5 encoder</w:t>
         <w:br/>
         <w:t xml:space="preserve">        ↓  skip connections</w:t>
         <w:br/>
@@ -3254,11 +3361,11 @@
         <w:br/>
         <w:t xml:space="preserve">        ↓</w:t>
         <w:br/>
-        <w:t>Segmentation head</w:t>
+        <w:t xml:space="preserve">Segmentation head   (auxiliary classification head on the encoder -&gt; cls_logits, used only in the training loss)</w:t>
         <w:br/>
         <w:t xml:space="preserve">        ↓</w:t>
         <w:br/>
-        <w:t>logits [3 x 384 x 384]</w:t>
+        <w:t xml:space="preserve">seg_logits [3 x 456 x 456]</w:t>
         <w:br/>
         <w:t xml:space="preserve">        ↓ sigmoid</w:t>
         <w:br/>
@@ -3278,7 +3385,7 @@
           <w:rFonts w:ascii="Liberation Sans" w:hAnsi="Liberation Sans" w:eastAsia="Liberation Sans"/>
           <w:sz w:val="21"/>
         </w:rPr>
-        <w:t>EfficientNet-B0 acts as the encoder and extracts multi-scale visual features. The U-Net decoder upsamples the encoded feature maps back to the segmentation resolution. Skip connections transfer spatial information from encoder stages to decoder stages, which helps recover organ boundaries and local structure. This encoder-decoder design is suitable for medical image segmentation because the task requires both high-level anatomical context and precise pixel-level localization.</w:t>
+        <w:t>EfficientNet-B5 acts as the encoder and extracts multi-scale visual features. The U-Net decoder upsamples the encoded feature maps back to the segmentation resolution. Skip connections transfer spatial information from encoder stages to decoder stages, which helps recover organ boundaries and local structure. This encoder-decoder design is suitable for medical image segmentation because the task requires both high-level anatomical context and precise pixel-level localization. The auxiliary classification head pools the deepest encoder features and predicts whether each organ is present in the slice; it adds a training signal, and inference uses only the segmentation logits.</w:t>
       </w:r>
     </w:p>
     <w:p>
@@ -3427,7 +3534,7 @@
                 <w:b w:val="0"/>
                 <w:sz w:val="17"/>
               </w:rPr>
-              <w:t>fold</w:t>
+              <w:t xml:space="preserve">encoder_name / use_aux_cls</w:t>
             </w:r>
           </w:p>
         </w:tc>
@@ -3448,7 +3555,7 @@
                 <w:b w:val="0"/>
                 <w:sz w:val="17"/>
               </w:rPr>
-              <w:t>0</w:t>
+              <w:t xml:space="preserve">efficientnet-b5 / True (B0 baseline: efficientnet-b0 / False)</w:t>
             </w:r>
           </w:p>
         </w:tc>
@@ -3474,7 +3581,7 @@
                 <w:b w:val="0"/>
                 <w:sz w:val="17"/>
               </w:rPr>
-              <w:t>epochs</w:t>
+              <w:t>fold</w:t>
             </w:r>
           </w:p>
         </w:tc>
@@ -3495,7 +3602,7 @@
                 <w:b w:val="0"/>
                 <w:sz w:val="17"/>
               </w:rPr>
-              <w:t>20</w:t>
+              <w:t>0</w:t>
             </w:r>
           </w:p>
         </w:tc>
@@ -3521,7 +3628,7 @@
                 <w:b w:val="0"/>
                 <w:sz w:val="17"/>
               </w:rPr>
-              <w:t>batch_size</w:t>
+              <w:t>epochs</w:t>
             </w:r>
           </w:p>
         </w:tc>
@@ -3542,7 +3649,7 @@
                 <w:b w:val="0"/>
                 <w:sz w:val="17"/>
               </w:rPr>
-              <w:t>8</w:t>
+              <w:t>20</w:t>
             </w:r>
           </w:p>
         </w:tc>
@@ -3568,7 +3675,7 @@
                 <w:b w:val="0"/>
                 <w:sz w:val="17"/>
               </w:rPr>
-              <w:t>img_size</w:t>
+              <w:t>batch_size</w:t>
             </w:r>
           </w:p>
         </w:tc>
@@ -3589,7 +3696,7 @@
                 <w:b w:val="0"/>
                 <w:sz w:val="17"/>
               </w:rPr>
-              <w:t>384</w:t>
+              <w:t xml:space="preserve">2 with accum_steps = 4 (effective batch 8; B0 baseline: 8)</w:t>
             </w:r>
           </w:p>
         </w:tc>
@@ -3615,7 +3722,7 @@
                 <w:b w:val="0"/>
                 <w:sz w:val="17"/>
               </w:rPr>
-              <w:t>optimizer</w:t>
+              <w:t>img_size</w:t>
             </w:r>
           </w:p>
         </w:tc>
@@ -3636,7 +3743,7 @@
                 <w:b w:val="0"/>
                 <w:sz w:val="17"/>
               </w:rPr>
-              <w:t>AdamW</w:t>
+              <w:t xml:space="preserve">456 (B0 baseline: 384)</w:t>
             </w:r>
           </w:p>
         </w:tc>
@@ -3662,7 +3769,7 @@
                 <w:b w:val="0"/>
                 <w:sz w:val="17"/>
               </w:rPr>
-              <w:t>learning rate</w:t>
+              <w:t>optimizer</w:t>
             </w:r>
           </w:p>
         </w:tc>
@@ -3683,7 +3790,7 @@
                 <w:b w:val="0"/>
                 <w:sz w:val="17"/>
               </w:rPr>
-              <w:t>1e-4</w:t>
+              <w:t>AdamW</w:t>
             </w:r>
           </w:p>
         </w:tc>
@@ -3709,7 +3816,7 @@
                 <w:b w:val="0"/>
                 <w:sz w:val="17"/>
               </w:rPr>
-              <w:t>weight_decay</w:t>
+              <w:t>learning rate</w:t>
             </w:r>
           </w:p>
         </w:tc>
@@ -3730,7 +3837,7 @@
                 <w:b w:val="0"/>
                 <w:sz w:val="17"/>
               </w:rPr>
-              <w:t>1e-2</w:t>
+              <w:t>1e-4</w:t>
             </w:r>
           </w:p>
         </w:tc>
@@ -3756,7 +3863,7 @@
                 <w:b w:val="0"/>
                 <w:sz w:val="17"/>
               </w:rPr>
-              <w:t>scheduler</w:t>
+              <w:t>weight_decay</w:t>
             </w:r>
           </w:p>
         </w:tc>
@@ -3777,7 +3884,7 @@
                 <w:b w:val="0"/>
                 <w:sz w:val="17"/>
               </w:rPr>
-              <w:t>CosineAnnealingLR</w:t>
+              <w:t>1e-2</w:t>
             </w:r>
           </w:p>
         </w:tc>
@@ -3803,7 +3910,7 @@
                 <w:b w:val="0"/>
                 <w:sz w:val="17"/>
               </w:rPr>
-              <w:t>T_max</w:t>
+              <w:t>scheduler</w:t>
             </w:r>
           </w:p>
         </w:tc>
@@ -3824,7 +3931,7 @@
                 <w:b w:val="0"/>
                 <w:sz w:val="17"/>
               </w:rPr>
-              <w:t>20</w:t>
+              <w:t>CosineAnnealingLR</w:t>
             </w:r>
           </w:p>
         </w:tc>
@@ -3850,7 +3957,7 @@
                 <w:b w:val="0"/>
                 <w:sz w:val="17"/>
               </w:rPr>
-              <w:t>eta_min</w:t>
+              <w:t>T_max</w:t>
             </w:r>
           </w:p>
         </w:tc>
@@ -3871,7 +3978,7 @@
                 <w:b w:val="0"/>
                 <w:sz w:val="17"/>
               </w:rPr>
-              <w:t>1e-6</w:t>
+              <w:t>20</w:t>
             </w:r>
           </w:p>
         </w:tc>
@@ -3897,7 +4004,7 @@
                 <w:b w:val="0"/>
                 <w:sz w:val="17"/>
               </w:rPr>
-              <w:t>loss</w:t>
+              <w:t>eta_min</w:t>
             </w:r>
           </w:p>
         </w:tc>
@@ -3918,7 +4025,7 @@
                 <w:b w:val="0"/>
                 <w:sz w:val="17"/>
               </w:rPr>
-              <w:t>BCEWithLogitsLoss + 3.0 * DiceLoss</w:t>
+              <w:t>1e-6</w:t>
             </w:r>
           </w:p>
         </w:tc>
@@ -3944,7 +4051,7 @@
                 <w:b w:val="0"/>
                 <w:sz w:val="17"/>
               </w:rPr>
-              <w:t>DiceLoss mode</w:t>
+              <w:t>loss</w:t>
             </w:r>
           </w:p>
         </w:tc>
@@ -3965,7 +4072,7 @@
                 <w:b w:val="0"/>
                 <w:sz w:val="17"/>
               </w:rPr>
-              <w:t>multilabel</w:t>
+              <w:t xml:space="preserve">BCEWithLogitsLoss + 3.0 * DiceLoss + 0.3 * BCEWithLogitsLoss (presence) (B0 baseline: without the presence term)</w:t>
             </w:r>
           </w:p>
         </w:tc>
@@ -3991,7 +4098,7 @@
                 <w:b w:val="0"/>
                 <w:sz w:val="17"/>
               </w:rPr>
-              <w:t>DiceLoss from_logits</w:t>
+              <w:t>DiceLoss mode</w:t>
             </w:r>
           </w:p>
         </w:tc>
@@ -4012,7 +4119,7 @@
                 <w:b w:val="0"/>
                 <w:sz w:val="17"/>
               </w:rPr>
-              <w:t>True</w:t>
+              <w:t>multilabel</w:t>
             </w:r>
           </w:p>
         </w:tc>
@@ -4038,7 +4145,7 @@
                 <w:b w:val="0"/>
                 <w:sz w:val="17"/>
               </w:rPr>
-              <w:t>DiceLoss smooth</w:t>
+              <w:t>DiceLoss from_logits</w:t>
             </w:r>
           </w:p>
         </w:tc>
@@ -4059,7 +4166,7 @@
                 <w:b w:val="0"/>
                 <w:sz w:val="17"/>
               </w:rPr>
-              <w:t>1e-6</w:t>
+              <w:t>True</w:t>
             </w:r>
           </w:p>
         </w:tc>
@@ -4085,7 +4192,7 @@
                 <w:b w:val="0"/>
                 <w:sz w:val="17"/>
               </w:rPr>
-              <w:t>AMP mixed precision</w:t>
+              <w:t>DiceLoss smooth</w:t>
             </w:r>
           </w:p>
         </w:tc>
@@ -4106,7 +4213,7 @@
                 <w:b w:val="0"/>
                 <w:sz w:val="17"/>
               </w:rPr>
-              <w:t>True</w:t>
+              <w:t>1e-6</w:t>
             </w:r>
           </w:p>
         </w:tc>
@@ -4132,7 +4239,7 @@
                 <w:b w:val="0"/>
                 <w:sz w:val="17"/>
               </w:rPr>
-              <w:t>num_workers</w:t>
+              <w:t>AMP mixed precision</w:t>
             </w:r>
           </w:p>
         </w:tc>
@@ -4153,7 +4260,7 @@
                 <w:b w:val="0"/>
                 <w:sz w:val="17"/>
               </w:rPr>
-              <w:t>2</w:t>
+              <w:t>True</w:t>
             </w:r>
           </w:p>
         </w:tc>
@@ -4179,7 +4286,7 @@
                 <w:b w:val="0"/>
                 <w:sz w:val="17"/>
               </w:rPr>
-              <w:t>GPU shown in output</w:t>
+              <w:t>num_workers</w:t>
             </w:r>
           </w:p>
         </w:tc>
@@ -4200,7 +4307,7 @@
                 <w:b w:val="0"/>
                 <w:sz w:val="17"/>
               </w:rPr>
-              <w:t>Tesla T4</w:t>
+              <w:t>2</w:t>
             </w:r>
           </w:p>
         </w:tc>
@@ -4226,7 +4333,7 @@
                 <w:b w:val="0"/>
                 <w:sz w:val="17"/>
               </w:rPr>
-              <w:t>train batches</w:t>
+              <w:t xml:space="preserve">GPU shown in output (B0 run)</w:t>
             </w:r>
           </w:p>
         </w:tc>
@@ -4247,7 +4354,7 @@
                 <w:b w:val="0"/>
                 <w:sz w:val="17"/>
               </w:rPr>
-              <w:t>3854</w:t>
+              <w:t>Tesla T4</w:t>
             </w:r>
           </w:p>
         </w:tc>
@@ -4273,7 +4380,54 @@
                 <w:b w:val="0"/>
                 <w:sz w:val="17"/>
               </w:rPr>
-              <w:t>validation batches</w:t>
+              <w:t xml:space="preserve">train batches (B0 run, batch 8)</w:t>
+            </w:r>
+          </w:p>
+        </w:tc>
+        <w:tc>
+          <w:tcPr>
+            <w:tcW w:type="dxa" w:w="6480"/>
+            <w:vAlign w:val="center"/>
+          </w:tcPr>
+          <w:p>
+            <w:pPr>
+              <w:spacing w:after="0"/>
+              <w:jc w:val="left"/>
+            </w:pPr>
+            <w:r/>
+            <w:r>
+              <w:rPr>
+                <w:rFonts w:ascii="Liberation Sans" w:hAnsi="Liberation Sans" w:eastAsia="Liberation Sans"/>
+                <w:b w:val="0"/>
+                <w:sz w:val="17"/>
+              </w:rPr>
+              <w:t>3854</w:t>
+            </w:r>
+          </w:p>
+        </w:tc>
+      </w:tr>
+      <w:tr>
+        <w:trPr>
+          <w:cantSplit/>
+        </w:trPr>
+        <w:tc>
+          <w:tcPr>
+            <w:tcW w:type="dxa" w:w="3456"/>
+            <w:vAlign w:val="center"/>
+          </w:tcPr>
+          <w:p>
+            <w:pPr>
+              <w:spacing w:after="0"/>
+              <w:jc w:val="left"/>
+            </w:pPr>
+            <w:r/>
+            <w:r>
+              <w:rPr>
+                <w:rFonts w:ascii="Liberation Sans" w:hAnsi="Liberation Sans" w:eastAsia="Liberation Sans"/>
+                <w:b w:val="0"/>
+                <w:sz w:val="17"/>
+              </w:rPr>
+              <w:t xml:space="preserve">validation batches (B0 run)</w:t>
             </w:r>
           </w:p>
         </w:tc>
@@ -4413,7 +4567,7 @@
                 <w:b w:val="0"/>
                 <w:sz w:val="16"/>
               </w:rPr>
-              <w:t>Resize(384,384); HorizontalFlip(p=0.5); Affine(translate_percent=-0.05~0.05, scale=0.9~1.1, rotate=-10~10, p=0.5); RandomBrightnessContrast(0.10, 0.10, p=0.3); ToTensorV2(transpose_mask=True)</w:t>
+              <w:t>Resize(456,456) [384 for B0]; HorizontalFlip(p=0.5); Affine(translate_percent=-0.05~0.05, scale=0.9~1.1, rotate=-10~10, p=0.5); RandomBrightnessContrast(0.10, 0.10, p=0.3); ToTensorV2(transpose_mask=True)</w:t>
             </w:r>
           </w:p>
         </w:tc>
@@ -4460,7 +4614,7 @@
                 <w:b w:val="0"/>
                 <w:sz w:val="16"/>
               </w:rPr>
-              <w:t>Resize(384,384); ToTensorV2(transpose_mask=True)</w:t>
+              <w:t xml:space="preserve">Resize(456,456) [384 for B0]; ToTensorV2(transpose_mask=True)</w:t>
             </w:r>
           </w:p>
         </w:tc>
@@ -4484,7 +4638,7 @@
           <w:rFonts w:ascii="Liberation Sans" w:hAnsi="Liberation Sans" w:eastAsia="Liberation Sans"/>
           <w:sz w:val="21"/>
         </w:rPr>
-        <w:t>The training loss combines BCE and Dice Loss:</w:t>
+        <w:t xml:space="preserve">The segmentation loss combines BCE and Dice Loss, and the final B5 model adds a presence-classification BCE term from the auxiliary head:</w:t>
       </w:r>
     </w:p>
     <w:p>
@@ -4496,7 +4650,7 @@
           <w:rFonts w:ascii="Liberation Mono" w:hAnsi="Liberation Mono" w:eastAsia="Liberation Mono"/>
           <w:sz w:val="16"/>
         </w:rPr>
-        <w:t>loss = BCEWithLogitsLoss(logits, targets) + 3.0 * DiceLoss(logits, targets)</w:t>
+        <w:t xml:space="preserve">loss = BCEWithLogitsLoss(seg_logits, masks) + 3.0 * DiceLoss(seg_logits, masks) + 0.3 * BCEWithLogitsLoss(cls_logits, presence)</w:t>
       </w:r>
     </w:p>
     <w:p>
@@ -4508,7 +4662,7 @@
           <w:rFonts w:ascii="Liberation Sans" w:hAnsi="Liberation Sans" w:eastAsia="Liberation Sans"/>
           <w:sz w:val="21"/>
         </w:rPr>
-        <w:t>BCEWithLogitsLoss optimizes pixel-level binary classification for each class. Dice Loss directly optimizes mask overlap, which is helpful for medical segmentation because foreground organs occupy only part of each image. In this run, Dice Loss is weighted by 3.0.</w:t>
+        <w:t>BCEWithLogitsLoss optimizes pixel-level binary classification for each class. Dice Loss directly optimizes mask overlap, which is helpful for medical segmentation because foreground organs occupy only part of each image. Dice Loss is weighted by 3.0. The presence targets are derived from the masks (a class is present if its mask has any positive pixel). The B0 baseline used only the first two terms.</w:t>
       </w:r>
     </w:p>
     <w:p>
@@ -4548,7 +4702,7 @@
           <w:rFonts w:ascii="Liberation Sans" w:hAnsi="Liberation Sans" w:eastAsia="Liberation Sans"/>
           <w:sz w:val="21"/>
         </w:rPr>
-        <w:t>The notebook saves a checkpoint whenever validation Dice improves. The best checkpoint is best_effnetb0_unet_c_order_fold0.pth. The threshold-tuning notebook loads this checkpoint and reports checkpoint epoch = 16 and best Dice = 0.8832072341556161.</w:t>
+        <w:t xml:space="preserve">The notebook saves a checkpoint whenever validation Dice improves. For the final model the best checkpoint is best_effnetb5_unet_c_order_fold0.pth, saved at epoch 20 with validation Dice 0.9112. For the B0 baseline it was best_effnetb0_unet_c_order_fold0.pth; the threshold-tuning notebook loaded it and reported checkpoint epoch = 16 and best Dice = 0.8832072341556161.</w:t>
       </w:r>
     </w:p>
     <w:p>
@@ -4562,7 +4716,7 @@
     <w:p>
       <w:pPr/>
       <w:r>
-        <w:t>Kaggle GPU sessions are capped at a hard 12-hour limit, and in Save &amp; Run All (Commit) mode a run that reaches that wall fails and discards all /kaggle/working outputs. To make long runs safe, the training notebook also writes a per-epoch resume checkpoint last_effnetb0_unet_c_order_fold0.pth containing the model, optimizer, scheduler, and AMP scaler state plus the current epoch and best Dice. With CFG.resume = True, re-running the notebook restores this state and continues from the next epoch, and the training-history CSV is rebuilt without duplicate rows. A predictive wall-clock guard, CFG.max_train_hours (default 11.0), stops training cleanly after an epoch when one more epoch would exceed the per-session budget, so the run is never killed mid-epoch. Each session gets a fresh budget, so a run that needs more than 12 hours can finish across multiple sessions by simply re-running.</w:t>
+        <w:t>Kaggle GPU sessions are capped at a hard 12-hour limit, and in Save &amp; Run All (Commit) mode a run that reaches that wall fails and discards all /kaggle/working outputs. To make long runs safe, the training notebook also writes a per-epoch resume checkpoint last_effnetb5_unet_c_order_fold0.pth (last_effnetb0_unet_c_order_fold0.pth for the baseline) containing the model, optimizer, scheduler, and AMP scaler state plus the current epoch and best Dice. With CFG.resume = True, re-running the notebook restores this state and continues from the next epoch, and the training-history CSV is rebuilt without duplicate rows. A predictive wall-clock guard, CFG.max_train_hours (default 11.0), stops training cleanly after an epoch when one more epoch would exceed the per-session budget, so the run is never killed mid-epoch. Each session gets a fresh budget, so a run that needs more than 12 hours can finish across multiple sessions by simply re-running. The B5 run (~42 min per epoch) was completed across multiple Kaggle sessions this way.</w:t>
       </w:r>
     </w:p>
     <w:tbl>
@@ -4606,7 +4760,7 @@
                 <w:b/>
                 <w:sz w:val="17"/>
               </w:rPr>
-              <w:t>Epoch</w:t>
+              <w:t>Model / epoch</w:t>
             </w:r>
           </w:p>
         </w:tc>
@@ -4786,7 +4940,180 @@
                 <w:b w:val="0"/>
                 <w:sz w:val="17"/>
               </w:rPr>
-              <w:t>16</w:t>
+              <w:t xml:space="preserve">B5 (final) / 20</w:t>
+            </w:r>
+          </w:p>
+        </w:tc>
+        <w:tc>
+          <w:tcPr>
+            <w:tcW w:type="dxa" w:w="1278"/>
+            <w:vAlign w:val="center"/>
+          </w:tcPr>
+          <w:p>
+            <w:pPr>
+              <w:spacing w:after="0"/>
+              <w:jc w:val="left"/>
+            </w:pPr>
+            <w:r/>
+            <w:r>
+              <w:rPr>
+                <w:rFonts w:ascii="Liberation Sans" w:hAnsi="Liberation Sans" w:eastAsia="Liberation Sans"/>
+                <w:b w:val="0"/>
+                <w:sz w:val="17"/>
+              </w:rPr>
+              <w:t xml:space="preserve">0.2249</w:t>
+            </w:r>
+          </w:p>
+        </w:tc>
+        <w:tc>
+          <w:tcPr>
+            <w:tcW w:type="dxa" w:w="1278"/>
+            <w:vAlign w:val="center"/>
+          </w:tcPr>
+          <w:p>
+            <w:pPr>
+              <w:spacing w:after="0"/>
+              <w:jc w:val="left"/>
+            </w:pPr>
+            <w:r/>
+            <w:r>
+              <w:rPr>
+                <w:rFonts w:ascii="Liberation Sans" w:hAnsi="Liberation Sans" w:eastAsia="Liberation Sans"/>
+                <w:b w:val="0"/>
+                <w:sz w:val="17"/>
+              </w:rPr>
+              <w:t xml:space="preserve">0.9277</w:t>
+            </w:r>
+          </w:p>
+        </w:tc>
+        <w:tc>
+          <w:tcPr>
+            <w:tcW w:type="dxa" w:w="1278"/>
+            <w:vAlign w:val="center"/>
+          </w:tcPr>
+          <w:p>
+            <w:pPr>
+              <w:spacing w:after="0"/>
+              <w:jc w:val="left"/>
+            </w:pPr>
+            <w:r/>
+            <w:r>
+              <w:rPr>
+                <w:rFonts w:ascii="Liberation Sans" w:hAnsi="Liberation Sans" w:eastAsia="Liberation Sans"/>
+                <w:b w:val="0"/>
+                <w:sz w:val="17"/>
+              </w:rPr>
+              <w:t xml:space="preserve">0.2533</w:t>
+            </w:r>
+          </w:p>
+        </w:tc>
+        <w:tc>
+          <w:tcPr>
+            <w:tcW w:type="dxa" w:w="1278"/>
+            <w:vAlign w:val="center"/>
+          </w:tcPr>
+          <w:p>
+            <w:pPr>
+              <w:spacing w:after="0"/>
+              <w:jc w:val="left"/>
+            </w:pPr>
+            <w:r/>
+            <w:r>
+              <w:rPr>
+                <w:rFonts w:ascii="Liberation Sans" w:hAnsi="Liberation Sans" w:eastAsia="Liberation Sans"/>
+                <w:b w:val="0"/>
+                <w:sz w:val="17"/>
+              </w:rPr>
+              <w:t xml:space="preserve">0.9112</w:t>
+            </w:r>
+          </w:p>
+        </w:tc>
+        <w:tc>
+          <w:tcPr>
+            <w:tcW w:type="dxa" w:w="1278"/>
+            <w:vAlign w:val="center"/>
+          </w:tcPr>
+          <w:p>
+            <w:pPr>
+              <w:spacing w:after="0"/>
+              <w:jc w:val="left"/>
+            </w:pPr>
+            <w:r/>
+            <w:r>
+              <w:rPr>
+                <w:rFonts w:ascii="Liberation Sans" w:hAnsi="Liberation Sans" w:eastAsia="Liberation Sans"/>
+                <w:b w:val="0"/>
+                <w:sz w:val="17"/>
+              </w:rPr>
+              <w:t xml:space="preserve">0.9015</w:t>
+            </w:r>
+          </w:p>
+        </w:tc>
+        <w:tc>
+          <w:tcPr>
+            <w:tcW w:type="dxa" w:w="1278"/>
+            <w:vAlign w:val="center"/>
+          </w:tcPr>
+          <w:p>
+            <w:pPr>
+              <w:spacing w:after="0"/>
+              <w:jc w:val="left"/>
+            </w:pPr>
+            <w:r/>
+            <w:r>
+              <w:rPr>
+                <w:rFonts w:ascii="Liberation Sans" w:hAnsi="Liberation Sans" w:eastAsia="Liberation Sans"/>
+                <w:b w:val="0"/>
+                <w:sz w:val="17"/>
+              </w:rPr>
+              <w:t xml:space="preserve">0.8828</w:t>
+            </w:r>
+          </w:p>
+        </w:tc>
+        <w:tc>
+          <w:tcPr>
+            <w:tcW w:type="dxa" w:w="1278"/>
+            <w:vAlign w:val="center"/>
+          </w:tcPr>
+          <w:p>
+            <w:pPr>
+              <w:spacing w:after="0"/>
+              <w:jc w:val="left"/>
+            </w:pPr>
+            <w:r/>
+            <w:r>
+              <w:rPr>
+                <w:rFonts w:ascii="Liberation Sans" w:hAnsi="Liberation Sans" w:eastAsia="Liberation Sans"/>
+                <w:b w:val="0"/>
+                <w:sz w:val="17"/>
+              </w:rPr>
+              <w:t xml:space="preserve">0.9494</w:t>
+            </w:r>
+          </w:p>
+        </w:tc>
+      </w:tr>
+      <w:tr>
+        <w:trPr>
+          <w:cantSplit/>
+        </w:trPr>
+        <w:tc>
+          <w:tcPr>
+            <w:tcW w:type="dxa" w:w="1278"/>
+            <w:vAlign w:val="center"/>
+          </w:tcPr>
+          <w:p>
+            <w:pPr>
+              <w:spacing w:after="0"/>
+              <w:jc w:val="left"/>
+            </w:pPr>
+            <w:r/>
+            <w:r>
+              <w:rPr>
+                <w:rFonts w:ascii="Liberation Sans" w:hAnsi="Liberation Sans" w:eastAsia="Liberation Sans"/>
+                <w:b w:val="0"/>
+                <w:sz w:val="17"/>
+              </w:rPr>
+              <w:t xml:space="preserve">B0 baseline / 16</w:t>
             </w:r>
           </w:p>
         </w:tc>
@@ -4957,7 +5284,7 @@
           <w:rFonts w:ascii="Liberation Sans" w:hAnsi="Liberation Sans" w:eastAsia="Liberation Sans"/>
           <w:sz w:val="21"/>
         </w:rPr>
-        <w:t>The model outputs probability maps after sigmoid. A threshold is required to convert each probability map into a binary mask. The threshold-tuning notebook does not retrain the model; it only evaluates the fold 0 validation set with different probability thresholds.</w:t>
+        <w:t>The model outputs probability maps after sigmoid. A threshold is required to convert each probability map into a binary mask. The threshold-tuning notebook does not retrain the model; it only evaluates the fold 0 validation set with different probability thresholds. For the final submission it was re-run on the B5 checkpoint.</w:t>
       </w:r>
     </w:p>
     <w:tbl>
@@ -5064,7 +5391,7 @@
                 <w:b w:val="0"/>
                 <w:sz w:val="16"/>
               </w:rPr>
-              <w:t>/kaggle/input/models/lingxd/best-effnetb0-unet-5-31/pytorch/default/1/best_effnetb0_unet_c_order_fold0.pth</w:t>
+              <w:t xml:space="preserve">/kaggle/input/uwgi-b5/best_effnetb5_unet_c_order_fold0.pth (B0 baseline run: /kaggle/input/models/lingxd/best-effnetb0-unet-5-31/pytorch/default/1/best_effnetb0_unet_c_order_fold0.pth)</w:t>
             </w:r>
           </w:p>
         </w:tc>
@@ -5268,7 +5595,7 @@
           <w:rFonts w:ascii="Liberation Sans" w:hAnsi="Liberation Sans" w:eastAsia="Liberation Sans"/>
           <w:sz w:val="21"/>
         </w:rPr>
-        <w:t>The final approach uses class-specific thresholds. Each class receives the threshold that maximizes its validation Dice under the training-style metric.</w:t>
+        <w:t xml:space="preserve">The final approach uses class-specific thresholds. Each class receives the threshold that maximizes its validation Dice under the training-style metric. The B5 submission uses thresholds re-tuned on the B5 checkpoint, which the submission notebook loads from thresholds_json_path; the B5 threshold values are not recorded in this repository. The tables below show the tuning result of the B0 baseline.</w:t>
       </w:r>
     </w:p>
     <w:tbl>
@@ -5329,7 +5656,7 @@
                 <w:b/>
                 <w:sz w:val="18"/>
               </w:rPr>
-              <w:t>Best threshold</w:t>
+              <w:t xml:space="preserve">Best threshold (B0)</w:t>
             </w:r>
           </w:p>
         </w:tc>
@@ -5571,7 +5898,7 @@
           <w:rFonts w:ascii="Liberation Sans" w:hAnsi="Liberation Sans" w:eastAsia="Liberation Sans"/>
           <w:sz w:val="21"/>
         </w:rPr>
-        <w:t>The final threshold dictionary is:</w:t>
+        <w:t xml:space="preserve">The B0 baseline threshold dictionary (also the submission notebook's fallback when no threshold JSON is found) is:</w:t>
       </w:r>
     </w:p>
     <w:p>
@@ -5603,7 +5930,7 @@
           <w:rFonts w:ascii="Liberation Sans" w:hAnsi="Liberation Sans" w:eastAsia="Liberation Sans"/>
           <w:sz w:val="21"/>
         </w:rPr>
-        <w:t>The validation comparison between the default threshold and class-specific thresholds is shown below.</w:t>
+        <w:t xml:space="preserve">The B0 validation comparison between the default threshold and class-specific thresholds is shown below.</w:t>
       </w:r>
     </w:p>
     <w:tbl>
@@ -5968,7 +6295,7 @@
           <w:rFonts w:ascii="Liberation Sans" w:hAnsi="Liberation Sans" w:eastAsia="Liberation Sans"/>
           <w:sz w:val="21"/>
         </w:rPr>
-        <w:t>The improvement from threshold tuning is small but positive. Mean validation Dice increases from 0.883176 to 0.884048, mainly due to slight improvements for small_bowel and stomach.</w:t>
+        <w:t>For B0, the improvement from threshold tuning is small but positive. Mean validation Dice increases from 0.883176 to 0.884048, mainly due to slight improvements for small_bowel and stomach.</w:t>
       </w:r>
     </w:p>
     <w:p>
@@ -6040,7 +6367,7 @@
           <w:rFonts w:ascii="Liberation Sans" w:hAnsi="Liberation Sans" w:eastAsia="Liberation Sans"/>
           <w:sz w:val="20"/>
         </w:rPr>
-        <w:t>Stack the three slices into a 3-channel input and resize it to 384 x 384.</w:t>
+        <w:t xml:space="preserve">Stack the three slices into a 3-channel input and resize it to 456 x 456.</w:t>
       </w:r>
     </w:p>
     <w:p>
@@ -6053,7 +6380,7 @@
           <w:rFonts w:ascii="Liberation Sans" w:hAnsi="Liberation Sans" w:eastAsia="Liberation Sans"/>
           <w:sz w:val="20"/>
         </w:rPr>
-        <w:t>Load best_effnetb0_unet_c_order_fold0.pth and run model inference to produce three-channel logits.</w:t>
+        <w:t xml:space="preserve">Load best_effnetb5_unet_c_order_fold0.pth (with use_aux_cls = True), run model inference, and take seg_logits from the (seg_logits, cls_logits) output to obtain three-channel segmentation logits.</w:t>
       </w:r>
     </w:p>
     <w:p>
@@ -6079,7 +6406,7 @@
           <w:rFonts w:ascii="Liberation Sans" w:hAnsi="Liberation Sans" w:eastAsia="Liberation Sans"/>
           <w:sz w:val="20"/>
         </w:rPr>
-        <w:t>Apply class-specific thresholds: large_bowel=0.39, small_bowel=0.59, stomach=0.33.</w:t>
+        <w:t xml:space="preserve">Apply the class-specific thresholds re-tuned for B5, loaded from thresholds_json_path.</w:t>
       </w:r>
     </w:p>
     <w:p>
@@ -6130,7 +6457,7 @@
           <w:rFonts w:ascii="Liberation Sans" w:hAnsi="Liberation Sans" w:eastAsia="Liberation Sans"/>
           <w:sz w:val="21"/>
         </w:rPr>
-        <w:t>The submitted result shown in the screenshot confirms that this pipeline successfully generated a valid submission and achieved Public 0.80577 and Private 0.77297.</w:t>
+        <w:t xml:space="preserve">The submitted results shown in the screenshot confirm that this pipeline generated valid submissions: the final B5 model achieved Public 0.81244 / Private 0.77691, and the B0 baseline achieved Public 0.80577 / Private 0.77297.</w:t>
       </w:r>
     </w:p>
     <w:p>
@@ -6351,7 +6678,7 @@
                 <w:b w:val="0"/>
                 <w:sz w:val="17"/>
               </w:rPr>
-              <w:t>384 x 384</w:t>
+              <w:t xml:space="preserve">456 x 456 (B0 baseline: 384 x 384)</w:t>
             </w:r>
           </w:p>
         </w:tc>
@@ -6492,7 +6819,7 @@
                 <w:b w:val="0"/>
                 <w:sz w:val="17"/>
               </w:rPr>
-              <w:t>SMP U-Net, EfficientNet-B0 encoder, 3 input channels, 3 output classes</w:t>
+              <w:t xml:space="preserve">SMP U-Net, EfficientNet-B5 encoder + auxiliary classification head (aux_params), 3 input channels, 3 output classes (B0 baseline: EfficientNet-B0, no auxiliary head)</w:t>
             </w:r>
           </w:p>
         </w:tc>
@@ -6539,7 +6866,7 @@
                 <w:b w:val="0"/>
                 <w:sz w:val="17"/>
               </w:rPr>
-              <w:t>best_effnetb0_unet_c_order_fold0.pth</w:t>
+              <w:t xml:space="preserve">best_effnetb5_unet_c_order_fold0.pth</w:t>
             </w:r>
           </w:p>
         </w:tc>
@@ -6586,7 +6913,7 @@
                 <w:b w:val="0"/>
                 <w:sz w:val="17"/>
               </w:rPr>
-              <w:t>large_bowel=0.39, small_bowel=0.59, stomach=0.33</w:t>
+              <w:t xml:space="preserve">Re-tuned for B5, loaded from thresholds_json_path (B0 baseline: large_bowel=0.39, small_bowel=0.59, stomach=0.33)</w:t>
             </w:r>
           </w:p>
         </w:tc>
@@ -6633,7 +6960,7 @@
                 <w:b w:val="0"/>
                 <w:sz w:val="17"/>
               </w:rPr>
-              <w:t>False in the threshold-tuning notebook</w:t>
+              <w:t xml:space="preserve">False in the threshold-tuning and submission notebooks</w:t>
             </w:r>
           </w:p>
         </w:tc>
@@ -6704,7 +7031,7 @@
           <w:rFonts w:ascii="Liberation Sans" w:hAnsi="Liberation Sans" w:eastAsia="Liberation Sans"/>
           <w:sz w:val="21"/>
         </w:rPr>
-        <w:t>This version is a clear and reproducible single-model baseline rather than a heavy ensemble. Its advantages are simple architecture, relatively low training cost, and a clean inference path. The main limitation is that leaderboard performance can likely be improved with additional folds, larger models, or stronger post-processing.</w:t>
+        <w:t xml:space="preserve">The final model is a single fold-0 EfficientNet-B5 model rather than an ensemble. Its advantages are a simple architecture and a clean inference path. The main limitation is that leaderboard performance can likely be improved with additional folds, ensembling, or stronger post-processing.</w:t>
       </w:r>
     </w:p>
     <w:p>
@@ -6717,20 +7044,7 @@
           <w:rFonts w:ascii="Liberation Sans" w:hAnsi="Liberation Sans" w:eastAsia="Liberation Sans"/>
           <w:sz w:val="20"/>
         </w:rPr>
-        <w:t>Only fold 0 is trained and used. A 5-fold ensemble would likely reduce variance and improve robustness.</w:t>
-      </w:r>
-    </w:p>
-    <w:p>
-      <w:pPr>
-        <w:pStyle w:val="ListBullet"/>
-        <w:spacing w:after="40"/>
-      </w:pPr>
-      <w:r>
-        <w:rPr>
-          <w:rFonts w:ascii="Liberation Sans" w:hAnsi="Liberation Sans" w:eastAsia="Liberation Sans"/>
-          <w:sz w:val="20"/>
-        </w:rPr>
-        <w:t>The model uses EfficientNet-B0. Larger encoders such as EfficientNet-B1/B2 or ResNet34/50 could be tested if more GPU time is available.</w:t>
+        <w:t xml:space="preserve">Only fold 0 is trained and used. A 5-fold ensemble of the B5 model would likely reduce variance and improve robustness.</w:t>
       </w:r>
     </w:p>
     <w:p>
@@ -6756,7 +7070,7 @@
           <w:rFonts w:ascii="Liberation Sans" w:hAnsi="Liberation Sans" w:eastAsia="Liberation Sans"/>
           <w:sz w:val="20"/>
         </w:rPr>
-        <w:t>Threshold tuning gives only a small improvement, so model quality, data augmentation, and split strategy are likely more important than threshold search alone.</w:t>
+        <w:t>On B0, threshold tuning gave only a small improvement, so model quality, data augmentation, and split strategy are likely more important than threshold search alone.</w:t>
       </w:r>
     </w:p>
     <w:p>
@@ -6801,7 +7115,7 @@
         <w:pStyle w:val="Heading1"/>
       </w:pPr>
       <w:r>
-        <w:t>Appendix A. Epoch-level Training History</w:t>
+        <w:t xml:space="preserve">Appendix A. Epoch-level Training History (B0 Baseline)</w:t>
       </w:r>
     </w:p>
     <w:p>
@@ -6813,7 +7127,7 @@
           <w:rFonts w:ascii="Liberation Sans" w:hAnsi="Liberation Sans" w:eastAsia="Liberation Sans"/>
           <w:sz w:val="21"/>
         </w:rPr>
-        <w:t>The table below is parsed from the training notebook output and records the 20-epoch training and validation history. The best validation Dice occurs at epoch 16.</w:t>
+        <w:t xml:space="preserve">The table below is parsed from the training notebook output and records the 20-epoch training and validation history of the EfficientNet-B0 baseline. The best validation Dice occurs at epoch 16. The history of the final B5 model is in Appendix B.</w:t>
       </w:r>
     </w:p>
     <w:tbl>
@@ -11369,12 +11683,12 @@
         <w:pStyle w:val="Heading1"/>
       </w:pPr>
       <w:r>
-        <w:t>Appendix B. EfficientNet-B5 Experiment (Submitted - Best Result)</w:t>
+        <w:t xml:space="preserve">Appendix B. EfficientNet-B5 Final Model</w:t>
       </w:r>
     </w:p>
     <w:p>
       <w:r>
-        <w:t>After the EfficientNet-B0 baseline described above, a higher-capacity variant was trained to push validation Dice further. It is now trained and submitted, and it is the best result so far: Public 0.81244 / Private 0.77691, versus the B0 baseline's 0.80577 / 0.77297. The text below records the configuration changes and results.</w:t>
+        <w:t xml:space="preserve">After the EfficientNet-B0 baseline, a higher-capacity variant was trained and became the final submitted model: Public 0.81244 / Private 0.77691, versus the B0 baseline's 0.80577 / 0.77297. This appendix records the configuration changes versus B0, the result comparison, and the full B5 training history.</w:t>
       </w:r>
     </w:p>
     <w:p>
@@ -11413,7 +11727,7 @@
           </w:tcPr>
           <w:p>
             <w:r>
-              <w:t>B0 baseline (submitted)</w:t>
+              <w:t xml:space="preserve">B0 baseline</w:t>
             </w:r>
           </w:p>
         </w:tc>
@@ -11423,7 +11737,7 @@
           </w:tcPr>
           <w:p>
             <w:r>
-              <w:t>B5 experiment</w:t>
+              <w:t xml:space="preserve">B5 (final)</w:t>
             </w:r>
           </w:p>
         </w:tc>
@@ -11599,7 +11913,7 @@
         <w:pStyle w:val="Heading2"/>
       </w:pPr>
       <w:r>
-        <w:t>B.2 Validation results so far</w:t>
+        <w:t xml:space="preserve">B.2 Validation and leaderboard results</w:t>
       </w:r>
     </w:p>
     <w:p>
@@ -11645,7 +11959,7 @@
           </w:tcPr>
           <w:p>
             <w:r>
-              <w:t>B5 experiment</w:t>
+              <w:t xml:space="preserve">B5 (final)</w:t>
             </w:r>
           </w:p>
         </w:tc>

</xml_diff>